<commit_message>
Added workflow of adding embedding vectors when the book is added
integrated chatbot tags into vector embeddings

Updated SRS Document

Updated StatusTracker.xls
</commit_message>
<xml_diff>
--- a/docs/SRSDocument.docx
+++ b/docs/SRSDocument.docx
@@ -146,7 +146,7 @@
         <w:rPr>
           <w:rtl w:val="0"/>
         </w:rPr>
-        <w:t xml:space="preserve"> : Nodejs for backend development , MongoDB to store books for their faster retrieval, MySQL for managing the transaction database which should not be modified easily ,Python for rapid API framework. </w:t>
+        <w:t xml:space="preserve"> : Nodejs for backend development , MongoDB to store books for their faster retrieval, MySQL for managing the transaction database which should not be modified easily.. </w:t>
       </w:r>
     </w:p>
     <w:p>
@@ -221,7 +221,7 @@
         <w:rPr>
           <w:rtl w:val="0"/>
         </w:rPr>
-        <w:t xml:space="preserve">: LLM (to be decided)+MCP servers</w:t>
+        <w:t xml:space="preserve">: LLM (Using Gemini)+MCP servers</w:t>
       </w:r>
     </w:p>
     <w:p>
@@ -476,14 +476,14 @@
         <w:tblLook w:val="0600"/>
       </w:tblPr>
       <w:tblGrid>
-        <w:gridCol w:w="840"/>
-        <w:gridCol w:w="2700"/>
+        <w:gridCol w:w="855"/>
+        <w:gridCol w:w="2685"/>
         <w:gridCol w:w="5085"/>
         <w:gridCol w:w="1275"/>
         <w:tblGridChange w:id="0">
           <w:tblGrid>
-            <w:gridCol w:w="840"/>
-            <w:gridCol w:w="2700"/>
+            <w:gridCol w:w="855"/>
+            <w:gridCol w:w="2685"/>
             <w:gridCol w:w="5085"/>
             <w:gridCol w:w="1275"/>
           </w:tblGrid>
@@ -692,7 +692,6 @@
               <w:rPr>
                 <w:rtl w:val="0"/>
               </w:rPr>
-              <w:t xml:space="preserve">1.</w:t>
             </w:r>
           </w:p>
         </w:tc>
@@ -2775,7 +2774,7 @@
               <w:rPr>
                 <w:rtl w:val="0"/>
               </w:rPr>
-              <w:t xml:space="preserve">Users and Children must be able to chat with the AI chatbot and get their recommended book</w:t>
+              <w:t xml:space="preserve">Users must be able to chat with the AI chatbot and get their recommended book</w:t>
             </w:r>
           </w:p>
         </w:tc>
@@ -4447,6 +4446,347 @@
               <w:t xml:space="preserve">R2</w:t>
             </w:r>
           </w:p>
+          <w:p>
+            <w:pPr>
+              <w:keepNext w:val="0"/>
+              <w:keepLines w:val="0"/>
+              <w:pageBreakBefore w:val="0"/>
+              <w:widowControl w:val="0"/>
+              <w:pBdr>
+                <w:top w:space="0" w:sz="0" w:val="nil"/>
+                <w:left w:space="0" w:sz="0" w:val="nil"/>
+                <w:bottom w:space="0" w:sz="0" w:val="nil"/>
+                <w:right w:space="0" w:sz="0" w:val="nil"/>
+                <w:between w:space="0" w:sz="0" w:val="nil"/>
+              </w:pBdr>
+              <w:shd w:fill="auto" w:val="clear"/>
+              <w:spacing w:after="0" w:before="0" w:line="240" w:lineRule="auto"/>
+              <w:ind w:left="0" w:right="0" w:firstLine="0"/>
+              <w:jc w:val="left"/>
+              <w:rPr/>
+            </w:pPr>
+            <w:r>
+              <w:rPr>
+                <w:rtl w:val="0"/>
+              </w:rPr>
+            </w:r>
+          </w:p>
+        </w:tc>
+      </w:tr>
+      <w:tr>
+        <w:trPr>
+          <w:cantSplit w:val="0"/>
+          <w:tblHeader w:val="0"/>
+        </w:trPr>
+        <w:tc>
+          <w:tcPr>
+            <w:shd w:fill="auto" w:val="clear"/>
+            <w:tcMar>
+              <w:top w:w="100.0" w:type="dxa"/>
+              <w:left w:w="100.0" w:type="dxa"/>
+              <w:bottom w:w="100.0" w:type="dxa"/>
+              <w:right w:w="100.0" w:type="dxa"/>
+            </w:tcMar>
+            <w:vAlign w:val="top"/>
+          </w:tcPr>
+          <w:p>
+            <w:pPr>
+              <w:keepNext w:val="0"/>
+              <w:keepLines w:val="0"/>
+              <w:pageBreakBefore w:val="0"/>
+              <w:widowControl w:val="0"/>
+              <w:pBdr>
+                <w:top w:space="0" w:sz="0" w:val="nil"/>
+                <w:left w:space="0" w:sz="0" w:val="nil"/>
+                <w:bottom w:space="0" w:sz="0" w:val="nil"/>
+                <w:right w:space="0" w:sz="0" w:val="nil"/>
+                <w:between w:space="0" w:sz="0" w:val="nil"/>
+              </w:pBdr>
+              <w:shd w:fill="auto" w:val="clear"/>
+              <w:spacing w:after="0" w:before="0" w:line="240" w:lineRule="auto"/>
+              <w:ind w:left="720" w:right="0" w:hanging="360"/>
+              <w:jc w:val="left"/>
+              <w:rPr/>
+            </w:pPr>
+            <w:r>
+              <w:rPr>
+                <w:rtl w:val="0"/>
+              </w:rPr>
+              <w:t xml:space="preserve">24.</w:t>
+            </w:r>
+          </w:p>
+        </w:tc>
+        <w:tc>
+          <w:tcPr>
+            <w:shd w:fill="auto" w:val="clear"/>
+            <w:tcMar>
+              <w:top w:w="100.0" w:type="dxa"/>
+              <w:left w:w="100.0" w:type="dxa"/>
+              <w:bottom w:w="100.0" w:type="dxa"/>
+              <w:right w:w="100.0" w:type="dxa"/>
+            </w:tcMar>
+            <w:vAlign w:val="top"/>
+          </w:tcPr>
+          <w:p>
+            <w:pPr>
+              <w:keepNext w:val="0"/>
+              <w:keepLines w:val="0"/>
+              <w:pageBreakBefore w:val="0"/>
+              <w:widowControl w:val="0"/>
+              <w:pBdr>
+                <w:top w:space="0" w:sz="0" w:val="nil"/>
+                <w:left w:space="0" w:sz="0" w:val="nil"/>
+                <w:bottom w:space="0" w:sz="0" w:val="nil"/>
+                <w:right w:space="0" w:sz="0" w:val="nil"/>
+                <w:between w:space="0" w:sz="0" w:val="nil"/>
+              </w:pBdr>
+              <w:shd w:fill="auto" w:val="clear"/>
+              <w:spacing w:after="0" w:before="0" w:line="240" w:lineRule="auto"/>
+              <w:ind w:left="0" w:right="0" w:firstLine="0"/>
+              <w:jc w:val="left"/>
+              <w:rPr/>
+            </w:pPr>
+            <w:r>
+              <w:rPr>
+                <w:rtl w:val="0"/>
+              </w:rPr>
+              <w:t xml:space="preserve">Add to Cart </w:t>
+            </w:r>
+          </w:p>
+        </w:tc>
+        <w:tc>
+          <w:tcPr>
+            <w:shd w:fill="auto" w:val="clear"/>
+            <w:tcMar>
+              <w:top w:w="100.0" w:type="dxa"/>
+              <w:left w:w="100.0" w:type="dxa"/>
+              <w:bottom w:w="100.0" w:type="dxa"/>
+              <w:right w:w="100.0" w:type="dxa"/>
+            </w:tcMar>
+            <w:vAlign w:val="top"/>
+          </w:tcPr>
+          <w:p>
+            <w:pPr>
+              <w:keepNext w:val="0"/>
+              <w:keepLines w:val="0"/>
+              <w:pageBreakBefore w:val="0"/>
+              <w:widowControl w:val="0"/>
+              <w:pBdr>
+                <w:top w:space="0" w:sz="0" w:val="nil"/>
+                <w:left w:space="0" w:sz="0" w:val="nil"/>
+                <w:bottom w:space="0" w:sz="0" w:val="nil"/>
+                <w:right w:space="0" w:sz="0" w:val="nil"/>
+                <w:between w:space="0" w:sz="0" w:val="nil"/>
+              </w:pBdr>
+              <w:shd w:fill="auto" w:val="clear"/>
+              <w:spacing w:after="0" w:before="0" w:line="240" w:lineRule="auto"/>
+              <w:ind w:left="0" w:right="0" w:firstLine="0"/>
+              <w:jc w:val="left"/>
+              <w:rPr/>
+            </w:pPr>
+            <w:r>
+              <w:rPr>
+                <w:rtl w:val="0"/>
+              </w:rPr>
+              <w:t xml:space="preserve">Users must be able to add the books from the same library to their carts so that they can order books from one library in bulk.</w:t>
+            </w:r>
+          </w:p>
+        </w:tc>
+        <w:tc>
+          <w:tcPr>
+            <w:shd w:fill="auto" w:val="clear"/>
+            <w:tcMar>
+              <w:top w:w="100.0" w:type="dxa"/>
+              <w:left w:w="100.0" w:type="dxa"/>
+              <w:bottom w:w="100.0" w:type="dxa"/>
+              <w:right w:w="100.0" w:type="dxa"/>
+            </w:tcMar>
+            <w:vAlign w:val="top"/>
+          </w:tcPr>
+          <w:p>
+            <w:pPr>
+              <w:keepNext w:val="0"/>
+              <w:keepLines w:val="0"/>
+              <w:pageBreakBefore w:val="0"/>
+              <w:widowControl w:val="0"/>
+              <w:pBdr>
+                <w:top w:space="0" w:sz="0" w:val="nil"/>
+                <w:left w:space="0" w:sz="0" w:val="nil"/>
+                <w:bottom w:space="0" w:sz="0" w:val="nil"/>
+                <w:right w:space="0" w:sz="0" w:val="nil"/>
+                <w:between w:space="0" w:sz="0" w:val="nil"/>
+              </w:pBdr>
+              <w:shd w:fill="auto" w:val="clear"/>
+              <w:spacing w:after="0" w:before="0" w:line="240" w:lineRule="auto"/>
+              <w:ind w:left="0" w:right="0" w:firstLine="0"/>
+              <w:jc w:val="left"/>
+              <w:rPr/>
+            </w:pPr>
+            <w:r>
+              <w:rPr>
+                <w:rtl w:val="0"/>
+              </w:rPr>
+              <w:t xml:space="preserve">R2</w:t>
+            </w:r>
+          </w:p>
+        </w:tc>
+      </w:tr>
+      <w:tr>
+        <w:trPr>
+          <w:cantSplit w:val="0"/>
+          <w:tblHeader w:val="0"/>
+        </w:trPr>
+        <w:tc>
+          <w:tcPr>
+            <w:shd w:fill="auto" w:val="clear"/>
+            <w:tcMar>
+              <w:top w:w="100.0" w:type="dxa"/>
+              <w:left w:w="100.0" w:type="dxa"/>
+              <w:bottom w:w="100.0" w:type="dxa"/>
+              <w:right w:w="100.0" w:type="dxa"/>
+            </w:tcMar>
+            <w:vAlign w:val="top"/>
+          </w:tcPr>
+          <w:p>
+            <w:pPr>
+              <w:keepNext w:val="0"/>
+              <w:keepLines w:val="0"/>
+              <w:pageBreakBefore w:val="0"/>
+              <w:widowControl w:val="0"/>
+              <w:pBdr>
+                <w:top w:space="0" w:sz="0" w:val="nil"/>
+                <w:left w:space="0" w:sz="0" w:val="nil"/>
+                <w:bottom w:space="0" w:sz="0" w:val="nil"/>
+                <w:right w:space="0" w:sz="0" w:val="nil"/>
+                <w:between w:space="0" w:sz="0" w:val="nil"/>
+              </w:pBdr>
+              <w:shd w:fill="auto" w:val="clear"/>
+              <w:spacing w:after="0" w:before="0" w:line="240" w:lineRule="auto"/>
+              <w:ind w:left="720" w:right="0" w:hanging="360"/>
+              <w:jc w:val="left"/>
+              <w:rPr/>
+            </w:pPr>
+            <w:r>
+              <w:rPr>
+                <w:rtl w:val="0"/>
+              </w:rPr>
+              <w:t xml:space="preserve">25.</w:t>
+            </w:r>
+          </w:p>
+        </w:tc>
+        <w:tc>
+          <w:tcPr>
+            <w:shd w:fill="auto" w:val="clear"/>
+            <w:tcMar>
+              <w:top w:w="100.0" w:type="dxa"/>
+              <w:left w:w="100.0" w:type="dxa"/>
+              <w:bottom w:w="100.0" w:type="dxa"/>
+              <w:right w:w="100.0" w:type="dxa"/>
+            </w:tcMar>
+            <w:vAlign w:val="top"/>
+          </w:tcPr>
+          <w:p>
+            <w:pPr>
+              <w:keepNext w:val="0"/>
+              <w:keepLines w:val="0"/>
+              <w:pageBreakBefore w:val="0"/>
+              <w:widowControl w:val="0"/>
+              <w:pBdr>
+                <w:top w:space="0" w:sz="0" w:val="nil"/>
+                <w:left w:space="0" w:sz="0" w:val="nil"/>
+                <w:bottom w:space="0" w:sz="0" w:val="nil"/>
+                <w:right w:space="0" w:sz="0" w:val="nil"/>
+                <w:between w:space="0" w:sz="0" w:val="nil"/>
+              </w:pBdr>
+              <w:shd w:fill="auto" w:val="clear"/>
+              <w:spacing w:after="0" w:before="0" w:line="240" w:lineRule="auto"/>
+              <w:ind w:left="0" w:right="0" w:firstLine="0"/>
+              <w:jc w:val="left"/>
+              <w:rPr/>
+            </w:pPr>
+            <w:r>
+              <w:rPr>
+                <w:rtl w:val="0"/>
+              </w:rPr>
+              <w:t xml:space="preserve">Author and Publisher pages</w:t>
+            </w:r>
+          </w:p>
+        </w:tc>
+        <w:tc>
+          <w:tcPr>
+            <w:shd w:fill="auto" w:val="clear"/>
+            <w:tcMar>
+              <w:top w:w="100.0" w:type="dxa"/>
+              <w:left w:w="100.0" w:type="dxa"/>
+              <w:bottom w:w="100.0" w:type="dxa"/>
+              <w:right w:w="100.0" w:type="dxa"/>
+            </w:tcMar>
+            <w:vAlign w:val="top"/>
+          </w:tcPr>
+          <w:p>
+            <w:pPr>
+              <w:keepNext w:val="0"/>
+              <w:keepLines w:val="0"/>
+              <w:pageBreakBefore w:val="0"/>
+              <w:widowControl w:val="0"/>
+              <w:pBdr>
+                <w:top w:space="0" w:sz="0" w:val="nil"/>
+                <w:left w:space="0" w:sz="0" w:val="nil"/>
+                <w:bottom w:space="0" w:sz="0" w:val="nil"/>
+                <w:right w:space="0" w:sz="0" w:val="nil"/>
+                <w:between w:space="0" w:sz="0" w:val="nil"/>
+              </w:pBdr>
+              <w:shd w:fill="auto" w:val="clear"/>
+              <w:spacing w:after="0" w:before="0" w:line="240" w:lineRule="auto"/>
+              <w:ind w:left="0" w:right="0" w:firstLine="0"/>
+              <w:jc w:val="left"/>
+              <w:rPr/>
+            </w:pPr>
+            <w:r>
+              <w:rPr>
+                <w:rtl w:val="0"/>
+              </w:rPr>
+              <w:t xml:space="preserve">Users should be able to see their favourite author and publisher along with the details regarding them</w:t>
+            </w:r>
+          </w:p>
+        </w:tc>
+        <w:tc>
+          <w:tcPr>
+            <w:shd w:fill="auto" w:val="clear"/>
+            <w:tcMar>
+              <w:top w:w="100.0" w:type="dxa"/>
+              <w:left w:w="100.0" w:type="dxa"/>
+              <w:bottom w:w="100.0" w:type="dxa"/>
+              <w:right w:w="100.0" w:type="dxa"/>
+            </w:tcMar>
+            <w:vAlign w:val="top"/>
+          </w:tcPr>
+          <w:p>
+            <w:pPr>
+              <w:keepNext w:val="0"/>
+              <w:keepLines w:val="0"/>
+              <w:pageBreakBefore w:val="0"/>
+              <w:widowControl w:val="0"/>
+              <w:pBdr>
+                <w:top w:space="0" w:sz="0" w:val="nil"/>
+                <w:left w:space="0" w:sz="0" w:val="nil"/>
+                <w:bottom w:space="0" w:sz="0" w:val="nil"/>
+                <w:right w:space="0" w:sz="0" w:val="nil"/>
+                <w:between w:space="0" w:sz="0" w:val="nil"/>
+              </w:pBdr>
+              <w:shd w:fill="auto" w:val="clear"/>
+              <w:spacing w:after="0" w:before="0" w:line="240" w:lineRule="auto"/>
+              <w:ind w:left="0" w:right="0" w:firstLine="0"/>
+              <w:jc w:val="left"/>
+              <w:rPr/>
+            </w:pPr>
+            <w:r>
+              <w:rPr>
+                <w:rtl w:val="0"/>
+              </w:rPr>
+              <w:t xml:space="preserve">R2</w:t>
+            </w:r>
+          </w:p>
         </w:tc>
       </w:tr>
     </w:tbl>
@@ -4463,17 +4803,37 @@
         </w:rPr>
         <w:t xml:space="preserve">Use case diagram:</w:t>
       </w:r>
-    </w:p>
-    <w:p>
-      <w:pPr>
-        <w:rPr/>
-      </w:pPr>
-      <w:r>
-        <w:rPr/>
+      <w:r>
+        <w:rPr>
+          <w:rtl w:val="0"/>
+        </w:rPr>
+      </w:r>
+    </w:p>
+    <w:p>
+      <w:pPr>
+        <w:pStyle w:val="Heading1"/>
+        <w:rPr/>
+      </w:pPr>
+      <w:bookmarkStart w:colFirst="0" w:colLast="0" w:name="_pa2cwerlnmih" w:id="7"/>
+      <w:bookmarkEnd w:id="7"/>
+      <w:r>
+        <w:rPr>
+          <w:rtl w:val="0"/>
+        </w:rPr>
+      </w:r>
+      <w:r>
         <w:drawing>
-          <wp:inline distB="114300" distT="114300" distL="114300" distR="114300">
-            <wp:extent cx="4801867" cy="8468223"/>
+          <wp:anchor allowOverlap="1" behindDoc="0" distB="228600" distT="228600" distL="228600" distR="228600" hidden="0" layoutInCell="1" locked="0" relativeHeight="0" simplePos="0">
+            <wp:simplePos x="0" y="0"/>
+            <wp:positionH relativeFrom="column">
+              <wp:posOffset>19051</wp:posOffset>
+            </wp:positionH>
+            <wp:positionV relativeFrom="paragraph">
+              <wp:posOffset>228600</wp:posOffset>
+            </wp:positionV>
+            <wp:extent cx="4414838" cy="9142141"/>
             <wp:effectExtent b="0" l="0" r="0" t="0"/>
+            <wp:wrapSquare wrapText="bothSides" distB="228600" distT="228600" distL="228600" distR="228600"/>
             <wp:docPr id="1" name="image1.png"/>
             <a:graphic>
               <a:graphicData uri="http://schemas.openxmlformats.org/drawingml/2006/picture">
@@ -4484,7 +4844,7 @@
                   </pic:nvPicPr>
                   <pic:blipFill>
                     <a:blip r:embed="rId6"/>
-                    <a:srcRect b="0" l="0" r="0" t="0"/>
+                    <a:srcRect b="-2435" l="0" r="-11450" t="0"/>
                     <a:stretch>
                       <a:fillRect/>
                     </a:stretch>
@@ -4492,7 +4852,7 @@
                   <pic:spPr>
                     <a:xfrm>
                       <a:off x="0" y="0"/>
-                      <a:ext cx="4801867" cy="8468223"/>
+                      <a:ext cx="4414838" cy="9142141"/>
                     </a:xfrm>
                     <a:prstGeom prst="rect"/>
                     <a:ln/>
@@ -4500,32 +4860,225 @@
                 </pic:pic>
               </a:graphicData>
             </a:graphic>
-          </wp:inline>
+          </wp:anchor>
         </w:drawing>
       </w:r>
-      <w:r>
-        <w:rPr>
-          <w:rtl w:val="0"/>
-        </w:rPr>
-      </w:r>
-    </w:p>
-    <w:p>
-      <w:pPr>
-        <w:rPr/>
-      </w:pPr>
-      <w:r>
-        <w:rPr>
-          <w:rtl w:val="0"/>
-        </w:rPr>
-      </w:r>
     </w:p>
     <w:p>
       <w:pPr>
         <w:pStyle w:val="Heading1"/>
         <w:rPr/>
       </w:pPr>
-      <w:bookmarkStart w:colFirst="0" w:colLast="0" w:name="_5yuyeba3pr8e" w:id="7"/>
-      <w:bookmarkEnd w:id="7"/>
+      <w:bookmarkStart w:colFirst="0" w:colLast="0" w:name="_yxqona25glpo" w:id="8"/>
+      <w:bookmarkEnd w:id="8"/>
+      <w:r>
+        <w:rPr>
+          <w:rtl w:val="0"/>
+        </w:rPr>
+      </w:r>
+    </w:p>
+    <w:p>
+      <w:pPr>
+        <w:pStyle w:val="Heading1"/>
+        <w:rPr/>
+      </w:pPr>
+      <w:bookmarkStart w:colFirst="0" w:colLast="0" w:name="_2d68xoaa6z2g" w:id="9"/>
+      <w:bookmarkEnd w:id="9"/>
+      <w:r>
+        <w:rPr>
+          <w:rtl w:val="0"/>
+        </w:rPr>
+      </w:r>
+    </w:p>
+    <w:p>
+      <w:pPr>
+        <w:pStyle w:val="Heading1"/>
+        <w:rPr/>
+      </w:pPr>
+      <w:bookmarkStart w:colFirst="0" w:colLast="0" w:name="_xrtg3frugck9" w:id="10"/>
+      <w:bookmarkEnd w:id="10"/>
+      <w:r>
+        <w:rPr>
+          <w:rtl w:val="0"/>
+        </w:rPr>
+      </w:r>
+    </w:p>
+    <w:p>
+      <w:pPr>
+        <w:pStyle w:val="Heading1"/>
+        <w:rPr/>
+      </w:pPr>
+      <w:bookmarkStart w:colFirst="0" w:colLast="0" w:name="_k9kcqcqha723" w:id="11"/>
+      <w:bookmarkEnd w:id="11"/>
+      <w:r>
+        <w:rPr>
+          <w:rtl w:val="0"/>
+        </w:rPr>
+      </w:r>
+    </w:p>
+    <w:p>
+      <w:pPr>
+        <w:pStyle w:val="Heading1"/>
+        <w:rPr/>
+      </w:pPr>
+      <w:bookmarkStart w:colFirst="0" w:colLast="0" w:name="_oycfuhx44yqc" w:id="12"/>
+      <w:bookmarkEnd w:id="12"/>
+      <w:r>
+        <w:rPr>
+          <w:rtl w:val="0"/>
+        </w:rPr>
+      </w:r>
+    </w:p>
+    <w:p>
+      <w:pPr>
+        <w:pStyle w:val="Heading1"/>
+        <w:rPr/>
+      </w:pPr>
+      <w:bookmarkStart w:colFirst="0" w:colLast="0" w:name="_ui34psw8aadi" w:id="13"/>
+      <w:bookmarkEnd w:id="13"/>
+      <w:r>
+        <w:rPr>
+          <w:rtl w:val="0"/>
+        </w:rPr>
+      </w:r>
+    </w:p>
+    <w:p>
+      <w:pPr>
+        <w:pStyle w:val="Heading1"/>
+        <w:rPr/>
+      </w:pPr>
+      <w:bookmarkStart w:colFirst="0" w:colLast="0" w:name="_gufwo3sufc2p" w:id="14"/>
+      <w:bookmarkEnd w:id="14"/>
+      <w:r>
+        <w:rPr>
+          <w:rtl w:val="0"/>
+        </w:rPr>
+      </w:r>
+    </w:p>
+    <w:p>
+      <w:pPr>
+        <w:pStyle w:val="Heading1"/>
+        <w:rPr/>
+      </w:pPr>
+      <w:bookmarkStart w:colFirst="0" w:colLast="0" w:name="_tyt3nkz0qvfk" w:id="15"/>
+      <w:bookmarkEnd w:id="15"/>
+      <w:r>
+        <w:rPr>
+          <w:rtl w:val="0"/>
+        </w:rPr>
+      </w:r>
+    </w:p>
+    <w:p>
+      <w:pPr>
+        <w:pStyle w:val="Heading1"/>
+        <w:rPr/>
+      </w:pPr>
+      <w:bookmarkStart w:colFirst="0" w:colLast="0" w:name="_u7n3ijscih6v" w:id="16"/>
+      <w:bookmarkEnd w:id="16"/>
+      <w:r>
+        <w:rPr>
+          <w:rtl w:val="0"/>
+        </w:rPr>
+      </w:r>
+    </w:p>
+    <w:p>
+      <w:pPr>
+        <w:pStyle w:val="Heading1"/>
+        <w:rPr/>
+      </w:pPr>
+      <w:bookmarkStart w:colFirst="0" w:colLast="0" w:name="_ggdtxe4ly4ll" w:id="17"/>
+      <w:bookmarkEnd w:id="17"/>
+      <w:r>
+        <w:rPr>
+          <w:rtl w:val="0"/>
+        </w:rPr>
+      </w:r>
+    </w:p>
+    <w:p>
+      <w:pPr>
+        <w:pStyle w:val="Heading1"/>
+        <w:rPr/>
+      </w:pPr>
+      <w:bookmarkStart w:colFirst="0" w:colLast="0" w:name="_lp7ll91pzf9u" w:id="18"/>
+      <w:bookmarkEnd w:id="18"/>
+      <w:r>
+        <w:rPr>
+          <w:rtl w:val="0"/>
+        </w:rPr>
+      </w:r>
+    </w:p>
+    <w:p>
+      <w:pPr>
+        <w:pStyle w:val="Heading1"/>
+        <w:rPr/>
+      </w:pPr>
+      <w:bookmarkStart w:colFirst="0" w:colLast="0" w:name="_exfyykz6p2t3" w:id="19"/>
+      <w:bookmarkEnd w:id="19"/>
+      <w:r>
+        <w:rPr>
+          <w:rtl w:val="0"/>
+        </w:rPr>
+      </w:r>
+    </w:p>
+    <w:p>
+      <w:pPr>
+        <w:pStyle w:val="Heading1"/>
+        <w:rPr/>
+      </w:pPr>
+      <w:bookmarkStart w:colFirst="0" w:colLast="0" w:name="_kf65zfzbkxw3" w:id="20"/>
+      <w:bookmarkEnd w:id="20"/>
+      <w:r>
+        <w:rPr>
+          <w:rtl w:val="0"/>
+        </w:rPr>
+      </w:r>
+    </w:p>
+    <w:p>
+      <w:pPr>
+        <w:pStyle w:val="Heading1"/>
+        <w:rPr/>
+      </w:pPr>
+      <w:bookmarkStart w:colFirst="0" w:colLast="0" w:name="_roif3f9fru7i" w:id="21"/>
+      <w:bookmarkEnd w:id="21"/>
+      <w:r>
+        <w:rPr>
+          <w:rtl w:val="0"/>
+        </w:rPr>
+      </w:r>
+    </w:p>
+    <w:p>
+      <w:pPr>
+        <w:pStyle w:val="Heading1"/>
+        <w:rPr/>
+      </w:pPr>
+      <w:bookmarkStart w:colFirst="0" w:colLast="0" w:name="_za34ce7v2jyn" w:id="22"/>
+      <w:bookmarkEnd w:id="22"/>
+      <w:r>
+        <w:rPr>
+          <w:rtl w:val="0"/>
+        </w:rPr>
+      </w:r>
+    </w:p>
+    <w:p>
+      <w:pPr>
+        <w:pStyle w:val="Heading1"/>
+        <w:rPr/>
+      </w:pPr>
+      <w:bookmarkStart w:colFirst="0" w:colLast="0" w:name="_fa0psgi70gzp" w:id="23"/>
+      <w:bookmarkEnd w:id="23"/>
+      <w:r>
+        <w:rPr>
+          <w:rtl w:val="0"/>
+        </w:rPr>
+      </w:r>
+    </w:p>
+    <w:p>
+      <w:pPr>
+        <w:pStyle w:val="Heading1"/>
+        <w:rPr/>
+      </w:pPr>
+      <w:bookmarkStart w:colFirst="0" w:colLast="0" w:name="_5yuyeba3pr8e" w:id="24"/>
+      <w:bookmarkEnd w:id="24"/>
       <w:r>
         <w:rPr>
           <w:rtl w:val="0"/>
@@ -10971,7 +11524,7 @@
               <w:rPr>
                 <w:rtl w:val="0"/>
               </w:rPr>
-              <w:t xml:space="preserve">User, Delivery System (e.g., Delhivery)</w:t>
+              <w:t xml:space="preserve">User, Delivery System </w:t>
             </w:r>
           </w:p>
         </w:tc>
@@ -11147,7 +11700,7 @@
               <w:rPr>
                 <w:rtl w:val="0"/>
               </w:rPr>
-              <w:t xml:space="preserve">2. System fetches order status via the delivery partner's API.</w:t>
+              <w:t xml:space="preserve">2. System fetches order status.</w:t>
             </w:r>
           </w:p>
           <w:p>
@@ -19683,6 +20236,1173 @@
         </w:tc>
       </w:tr>
     </w:tbl>
+    <w:p>
+      <w:pPr>
+        <w:rPr/>
+      </w:pPr>
+      <w:r>
+        <w:rPr>
+          <w:rtl w:val="0"/>
+        </w:rPr>
+      </w:r>
+    </w:p>
+    <w:tbl>
+      <w:tblPr>
+        <w:tblStyle w:val="Table25"/>
+        <w:tblW w:w="8895.0" w:type="dxa"/>
+        <w:jc w:val="left"/>
+        <w:tblBorders>
+          <w:top w:color="000000" w:space="0" w:sz="0" w:val="nil"/>
+          <w:left w:color="000000" w:space="0" w:sz="0" w:val="nil"/>
+          <w:bottom w:color="000000" w:space="0" w:sz="0" w:val="nil"/>
+          <w:right w:color="000000" w:space="0" w:sz="0" w:val="nil"/>
+          <w:insideH w:color="000000" w:space="0" w:sz="0" w:val="nil"/>
+          <w:insideV w:color="000000" w:space="0" w:sz="0" w:val="nil"/>
+        </w:tblBorders>
+        <w:tblLayout w:type="fixed"/>
+        <w:tblLook w:val="0600"/>
+      </w:tblPr>
+      <w:tblGrid>
+        <w:gridCol w:w="1980"/>
+        <w:gridCol w:w="6915"/>
+        <w:tblGridChange w:id="0">
+          <w:tblGrid>
+            <w:gridCol w:w="1980"/>
+            <w:gridCol w:w="6915"/>
+          </w:tblGrid>
+        </w:tblGridChange>
+      </w:tblGrid>
+      <w:tr>
+        <w:trPr>
+          <w:cantSplit w:val="0"/>
+          <w:trHeight w:val="600" w:hRule="atLeast"/>
+          <w:tblHeader w:val="0"/>
+        </w:trPr>
+        <w:tc>
+          <w:tcPr>
+            <w:tcBorders>
+              <w:top w:color="1f1f1f" w:space="0" w:sz="5" w:val="single"/>
+              <w:left w:color="1f1f1f" w:space="0" w:sz="5" w:val="single"/>
+              <w:bottom w:color="1f1f1f" w:space="0" w:sz="5" w:val="single"/>
+              <w:right w:color="1f1f1f" w:space="0" w:sz="5" w:val="single"/>
+            </w:tcBorders>
+            <w:tcMar>
+              <w:top w:w="240.0" w:type="dxa"/>
+              <w:left w:w="120.0" w:type="dxa"/>
+              <w:bottom w:w="240.0" w:type="dxa"/>
+              <w:right w:w="180.0" w:type="dxa"/>
+            </w:tcMar>
+            <w:vAlign w:val="top"/>
+          </w:tcPr>
+          <w:p>
+            <w:pPr>
+              <w:spacing w:line="240" w:lineRule="auto"/>
+              <w:rPr/>
+            </w:pPr>
+            <w:r>
+              <w:rPr>
+                <w:rtl w:val="0"/>
+              </w:rPr>
+              <w:t xml:space="preserve">Use Case No:</w:t>
+            </w:r>
+          </w:p>
+        </w:tc>
+        <w:tc>
+          <w:tcPr>
+            <w:tcBorders>
+              <w:top w:color="1f1f1f" w:space="0" w:sz="5" w:val="single"/>
+              <w:left w:color="1f1f1f" w:space="0" w:sz="5" w:val="single"/>
+              <w:bottom w:color="1f1f1f" w:space="0" w:sz="5" w:val="single"/>
+              <w:right w:color="1f1f1f" w:space="0" w:sz="5" w:val="single"/>
+            </w:tcBorders>
+            <w:tcMar>
+              <w:top w:w="240.0" w:type="dxa"/>
+              <w:left w:w="0.0" w:type="dxa"/>
+              <w:bottom w:w="240.0" w:type="dxa"/>
+              <w:right w:w="0.0" w:type="dxa"/>
+            </w:tcMar>
+            <w:vAlign w:val="top"/>
+          </w:tcPr>
+          <w:p>
+            <w:pPr>
+              <w:spacing w:line="240" w:lineRule="auto"/>
+              <w:rPr/>
+            </w:pPr>
+            <w:r>
+              <w:rPr>
+                <w:rtl w:val="0"/>
+              </w:rPr>
+              <w:t xml:space="preserve">UC-24</w:t>
+            </w:r>
+          </w:p>
+        </w:tc>
+      </w:tr>
+      <w:tr>
+        <w:trPr>
+          <w:cantSplit w:val="0"/>
+          <w:trHeight w:val="450" w:hRule="atLeast"/>
+          <w:tblHeader w:val="0"/>
+        </w:trPr>
+        <w:tc>
+          <w:tcPr>
+            <w:tcBorders>
+              <w:top w:color="1f1f1f" w:space="0" w:sz="5" w:val="single"/>
+              <w:left w:color="1f1f1f" w:space="0" w:sz="5" w:val="single"/>
+              <w:bottom w:color="1f1f1f" w:space="0" w:sz="5" w:val="single"/>
+              <w:right w:color="1f1f1f" w:space="0" w:sz="5" w:val="single"/>
+            </w:tcBorders>
+            <w:tcMar>
+              <w:top w:w="240.0" w:type="dxa"/>
+              <w:left w:w="120.0" w:type="dxa"/>
+              <w:bottom w:w="240.0" w:type="dxa"/>
+              <w:right w:w="180.0" w:type="dxa"/>
+            </w:tcMar>
+            <w:vAlign w:val="top"/>
+          </w:tcPr>
+          <w:p>
+            <w:pPr>
+              <w:spacing w:line="240" w:lineRule="auto"/>
+              <w:rPr/>
+            </w:pPr>
+            <w:r>
+              <w:rPr>
+                <w:rtl w:val="0"/>
+              </w:rPr>
+              <w:t xml:space="preserve">Use Case Name:</w:t>
+            </w:r>
+          </w:p>
+        </w:tc>
+        <w:tc>
+          <w:tcPr>
+            <w:tcBorders>
+              <w:top w:color="1f1f1f" w:space="0" w:sz="5" w:val="single"/>
+              <w:left w:color="1f1f1f" w:space="0" w:sz="5" w:val="single"/>
+              <w:bottom w:color="1f1f1f" w:space="0" w:sz="5" w:val="single"/>
+              <w:right w:color="1f1f1f" w:space="0" w:sz="5" w:val="single"/>
+            </w:tcBorders>
+            <w:tcMar>
+              <w:top w:w="240.0" w:type="dxa"/>
+              <w:left w:w="0.0" w:type="dxa"/>
+              <w:bottom w:w="240.0" w:type="dxa"/>
+              <w:right w:w="0.0" w:type="dxa"/>
+            </w:tcMar>
+            <w:vAlign w:val="top"/>
+          </w:tcPr>
+          <w:p>
+            <w:pPr>
+              <w:spacing w:line="240" w:lineRule="auto"/>
+              <w:rPr/>
+            </w:pPr>
+            <w:r>
+              <w:rPr>
+                <w:rtl w:val="0"/>
+              </w:rPr>
+              <w:t xml:space="preserve">Add to Cart</w:t>
+            </w:r>
+          </w:p>
+        </w:tc>
+      </w:tr>
+      <w:tr>
+        <w:trPr>
+          <w:cantSplit w:val="0"/>
+          <w:trHeight w:val="720" w:hRule="atLeast"/>
+          <w:tblHeader w:val="0"/>
+        </w:trPr>
+        <w:tc>
+          <w:tcPr>
+            <w:tcBorders>
+              <w:top w:color="1f1f1f" w:space="0" w:sz="5" w:val="single"/>
+              <w:left w:color="1f1f1f" w:space="0" w:sz="5" w:val="single"/>
+              <w:bottom w:color="1f1f1f" w:space="0" w:sz="5" w:val="single"/>
+              <w:right w:color="1f1f1f" w:space="0" w:sz="5" w:val="single"/>
+            </w:tcBorders>
+            <w:tcMar>
+              <w:top w:w="240.0" w:type="dxa"/>
+              <w:left w:w="120.0" w:type="dxa"/>
+              <w:bottom w:w="240.0" w:type="dxa"/>
+              <w:right w:w="180.0" w:type="dxa"/>
+            </w:tcMar>
+            <w:vAlign w:val="top"/>
+          </w:tcPr>
+          <w:p>
+            <w:pPr>
+              <w:spacing w:line="240" w:lineRule="auto"/>
+              <w:rPr/>
+            </w:pPr>
+            <w:r>
+              <w:rPr>
+                <w:rtl w:val="0"/>
+              </w:rPr>
+              <w:t xml:space="preserve">Overview:</w:t>
+            </w:r>
+          </w:p>
+        </w:tc>
+        <w:tc>
+          <w:tcPr>
+            <w:tcBorders>
+              <w:top w:color="1f1f1f" w:space="0" w:sz="5" w:val="single"/>
+              <w:left w:color="1f1f1f" w:space="0" w:sz="5" w:val="single"/>
+              <w:bottom w:color="1f1f1f" w:space="0" w:sz="5" w:val="single"/>
+              <w:right w:color="1f1f1f" w:space="0" w:sz="5" w:val="single"/>
+            </w:tcBorders>
+            <w:tcMar>
+              <w:top w:w="240.0" w:type="dxa"/>
+              <w:left w:w="0.0" w:type="dxa"/>
+              <w:bottom w:w="240.0" w:type="dxa"/>
+              <w:right w:w="0.0" w:type="dxa"/>
+            </w:tcMar>
+            <w:vAlign w:val="top"/>
+          </w:tcPr>
+          <w:p>
+            <w:pPr>
+              <w:spacing w:line="240" w:lineRule="auto"/>
+              <w:rPr/>
+            </w:pPr>
+            <w:r>
+              <w:rPr>
+                <w:rtl w:val="0"/>
+              </w:rPr>
+              <w:t xml:space="preserve">Users add the books they want to buy from a single library into their carts</w:t>
+            </w:r>
+          </w:p>
+        </w:tc>
+      </w:tr>
+      <w:tr>
+        <w:trPr>
+          <w:cantSplit w:val="0"/>
+          <w:trHeight w:val="120" w:hRule="atLeast"/>
+          <w:tblHeader w:val="0"/>
+        </w:trPr>
+        <w:tc>
+          <w:tcPr>
+            <w:tcBorders>
+              <w:top w:color="1f1f1f" w:space="0" w:sz="5" w:val="single"/>
+              <w:left w:color="1f1f1f" w:space="0" w:sz="5" w:val="single"/>
+              <w:bottom w:color="1f1f1f" w:space="0" w:sz="5" w:val="single"/>
+              <w:right w:color="1f1f1f" w:space="0" w:sz="5" w:val="single"/>
+            </w:tcBorders>
+            <w:tcMar>
+              <w:top w:w="240.0" w:type="dxa"/>
+              <w:left w:w="120.0" w:type="dxa"/>
+              <w:bottom w:w="240.0" w:type="dxa"/>
+              <w:right w:w="180.0" w:type="dxa"/>
+            </w:tcMar>
+            <w:vAlign w:val="top"/>
+          </w:tcPr>
+          <w:p>
+            <w:pPr>
+              <w:spacing w:line="240" w:lineRule="auto"/>
+              <w:rPr/>
+            </w:pPr>
+            <w:r>
+              <w:rPr>
+                <w:rtl w:val="0"/>
+              </w:rPr>
+              <w:t xml:space="preserve">Actors:</w:t>
+            </w:r>
+          </w:p>
+        </w:tc>
+        <w:tc>
+          <w:tcPr>
+            <w:tcBorders>
+              <w:top w:color="1f1f1f" w:space="0" w:sz="5" w:val="single"/>
+              <w:left w:color="1f1f1f" w:space="0" w:sz="5" w:val="single"/>
+              <w:bottom w:color="1f1f1f" w:space="0" w:sz="5" w:val="single"/>
+              <w:right w:color="1f1f1f" w:space="0" w:sz="5" w:val="single"/>
+            </w:tcBorders>
+            <w:tcMar>
+              <w:top w:w="240.0" w:type="dxa"/>
+              <w:left w:w="0.0" w:type="dxa"/>
+              <w:bottom w:w="240.0" w:type="dxa"/>
+              <w:right w:w="0.0" w:type="dxa"/>
+            </w:tcMar>
+            <w:vAlign w:val="top"/>
+          </w:tcPr>
+          <w:p>
+            <w:pPr>
+              <w:spacing w:line="240" w:lineRule="auto"/>
+              <w:rPr/>
+            </w:pPr>
+            <w:r>
+              <w:rPr>
+                <w:rtl w:val="0"/>
+              </w:rPr>
+              <w:t xml:space="preserve">User</w:t>
+            </w:r>
+          </w:p>
+        </w:tc>
+      </w:tr>
+      <w:tr>
+        <w:trPr>
+          <w:cantSplit w:val="0"/>
+          <w:trHeight w:val="135" w:hRule="atLeast"/>
+          <w:tblHeader w:val="0"/>
+        </w:trPr>
+        <w:tc>
+          <w:tcPr>
+            <w:tcBorders>
+              <w:top w:color="1f1f1f" w:space="0" w:sz="5" w:val="single"/>
+              <w:left w:color="1f1f1f" w:space="0" w:sz="5" w:val="single"/>
+              <w:bottom w:color="1f1f1f" w:space="0" w:sz="5" w:val="single"/>
+              <w:right w:color="1f1f1f" w:space="0" w:sz="5" w:val="single"/>
+            </w:tcBorders>
+            <w:tcMar>
+              <w:top w:w="240.0" w:type="dxa"/>
+              <w:left w:w="120.0" w:type="dxa"/>
+              <w:bottom w:w="240.0" w:type="dxa"/>
+              <w:right w:w="180.0" w:type="dxa"/>
+            </w:tcMar>
+            <w:vAlign w:val="top"/>
+          </w:tcPr>
+          <w:p>
+            <w:pPr>
+              <w:spacing w:line="240" w:lineRule="auto"/>
+              <w:rPr/>
+            </w:pPr>
+            <w:r>
+              <w:rPr>
+                <w:rtl w:val="0"/>
+              </w:rPr>
+              <w:t xml:space="preserve">Pre condition:</w:t>
+            </w:r>
+          </w:p>
+        </w:tc>
+        <w:tc>
+          <w:tcPr>
+            <w:tcBorders>
+              <w:top w:color="1f1f1f" w:space="0" w:sz="5" w:val="single"/>
+              <w:left w:color="1f1f1f" w:space="0" w:sz="5" w:val="single"/>
+              <w:bottom w:color="1f1f1f" w:space="0" w:sz="5" w:val="single"/>
+              <w:right w:color="1f1f1f" w:space="0" w:sz="5" w:val="single"/>
+            </w:tcBorders>
+            <w:tcMar>
+              <w:top w:w="240.0" w:type="dxa"/>
+              <w:left w:w="0.0" w:type="dxa"/>
+              <w:bottom w:w="240.0" w:type="dxa"/>
+              <w:right w:w="0.0" w:type="dxa"/>
+            </w:tcMar>
+            <w:vAlign w:val="top"/>
+          </w:tcPr>
+          <w:p>
+            <w:pPr>
+              <w:spacing w:line="240" w:lineRule="auto"/>
+              <w:rPr/>
+            </w:pPr>
+            <w:r>
+              <w:rPr>
+                <w:rtl w:val="0"/>
+              </w:rPr>
+              <w:t xml:space="preserve">User must have an account and the book they want to add must be in stock</w:t>
+            </w:r>
+          </w:p>
+        </w:tc>
+      </w:tr>
+      <w:tr>
+        <w:trPr>
+          <w:cantSplit w:val="0"/>
+          <w:trHeight w:val="2970" w:hRule="atLeast"/>
+          <w:tblHeader w:val="0"/>
+        </w:trPr>
+        <w:tc>
+          <w:tcPr>
+            <w:tcBorders>
+              <w:top w:color="1f1f1f" w:space="0" w:sz="5" w:val="single"/>
+              <w:left w:color="1f1f1f" w:space="0" w:sz="5" w:val="single"/>
+              <w:bottom w:color="1f1f1f" w:space="0" w:sz="5" w:val="single"/>
+              <w:right w:color="1f1f1f" w:space="0" w:sz="5" w:val="single"/>
+            </w:tcBorders>
+            <w:tcMar>
+              <w:top w:w="240.0" w:type="dxa"/>
+              <w:left w:w="120.0" w:type="dxa"/>
+              <w:bottom w:w="240.0" w:type="dxa"/>
+              <w:right w:w="180.0" w:type="dxa"/>
+            </w:tcMar>
+            <w:vAlign w:val="top"/>
+          </w:tcPr>
+          <w:p>
+            <w:pPr>
+              <w:spacing w:line="240" w:lineRule="auto"/>
+              <w:rPr/>
+            </w:pPr>
+            <w:r>
+              <w:rPr>
+                <w:rtl w:val="0"/>
+              </w:rPr>
+              <w:t xml:space="preserve">Flow:</w:t>
+            </w:r>
+          </w:p>
+        </w:tc>
+        <w:tc>
+          <w:tcPr>
+            <w:tcBorders>
+              <w:top w:color="1f1f1f" w:space="0" w:sz="5" w:val="single"/>
+              <w:left w:color="1f1f1f" w:space="0" w:sz="5" w:val="single"/>
+              <w:bottom w:color="1f1f1f" w:space="0" w:sz="5" w:val="single"/>
+              <w:right w:color="1f1f1f" w:space="0" w:sz="5" w:val="single"/>
+            </w:tcBorders>
+            <w:tcMar>
+              <w:top w:w="240.0" w:type="dxa"/>
+              <w:left w:w="0.0" w:type="dxa"/>
+              <w:bottom w:w="240.0" w:type="dxa"/>
+              <w:right w:w="0.0" w:type="dxa"/>
+            </w:tcMar>
+            <w:vAlign w:val="top"/>
+          </w:tcPr>
+          <w:p>
+            <w:pPr>
+              <w:spacing w:line="240" w:lineRule="auto"/>
+              <w:rPr/>
+            </w:pPr>
+            <w:r>
+              <w:rPr>
+                <w:rtl w:val="0"/>
+              </w:rPr>
+              <w:t xml:space="preserve">Main Flow:</w:t>
+            </w:r>
+          </w:p>
+          <w:p>
+            <w:pPr>
+              <w:spacing w:line="240" w:lineRule="auto"/>
+              <w:rPr/>
+            </w:pPr>
+            <w:r>
+              <w:rPr>
+                <w:rtl w:val="0"/>
+              </w:rPr>
+            </w:r>
+          </w:p>
+          <w:p>
+            <w:pPr>
+              <w:spacing w:line="240" w:lineRule="auto"/>
+              <w:rPr/>
+            </w:pPr>
+            <w:r>
+              <w:rPr>
+                <w:rtl w:val="0"/>
+              </w:rPr>
+              <w:t xml:space="preserve">1. User goes to the book detail section of a book</w:t>
+            </w:r>
+          </w:p>
+          <w:p>
+            <w:pPr>
+              <w:spacing w:line="240" w:lineRule="auto"/>
+              <w:rPr/>
+            </w:pPr>
+            <w:r>
+              <w:rPr>
+                <w:rtl w:val="0"/>
+              </w:rPr>
+              <w:t xml:space="preserve">2. The user clicks on the ‘Add to Cart’ option there.</w:t>
+            </w:r>
+          </w:p>
+          <w:p>
+            <w:pPr>
+              <w:spacing w:line="240" w:lineRule="auto"/>
+              <w:rPr/>
+            </w:pPr>
+            <w:r>
+              <w:rPr>
+                <w:rtl w:val="0"/>
+              </w:rPr>
+              <w:t xml:space="preserve">3. The book gets added into the cart and the user can make the payment for the books in their cart for delivery. </w:t>
+            </w:r>
+          </w:p>
+          <w:p>
+            <w:pPr>
+              <w:spacing w:line="240" w:lineRule="auto"/>
+              <w:rPr/>
+            </w:pPr>
+            <w:r>
+              <w:rPr>
+                <w:rtl w:val="0"/>
+              </w:rPr>
+            </w:r>
+          </w:p>
+          <w:p>
+            <w:pPr>
+              <w:spacing w:line="240" w:lineRule="auto"/>
+              <w:rPr/>
+            </w:pPr>
+            <w:r>
+              <w:rPr>
+                <w:rtl w:val="0"/>
+              </w:rPr>
+              <w:t xml:space="preserve">Alternate Flow:</w:t>
+            </w:r>
+          </w:p>
+          <w:p>
+            <w:pPr>
+              <w:spacing w:line="240" w:lineRule="auto"/>
+              <w:rPr/>
+            </w:pPr>
+            <w:r>
+              <w:rPr>
+                <w:rtl w:val="0"/>
+              </w:rPr>
+            </w:r>
+          </w:p>
+          <w:p>
+            <w:pPr>
+              <w:spacing w:line="240" w:lineRule="auto"/>
+              <w:rPr/>
+            </w:pPr>
+            <w:r>
+              <w:rPr>
+                <w:rtl w:val="0"/>
+              </w:rPr>
+              <w:t xml:space="preserve">2a. If the book is not present in the same library of the other books in the cart , then user should not be able to add that book into their cart.</w:t>
+            </w:r>
+          </w:p>
+        </w:tc>
+      </w:tr>
+      <w:tr>
+        <w:trPr>
+          <w:cantSplit w:val="0"/>
+          <w:trHeight w:val="810" w:hRule="atLeast"/>
+          <w:tblHeader w:val="0"/>
+        </w:trPr>
+        <w:tc>
+          <w:tcPr>
+            <w:tcBorders>
+              <w:top w:color="1f1f1f" w:space="0" w:sz="5" w:val="single"/>
+              <w:left w:color="1f1f1f" w:space="0" w:sz="5" w:val="single"/>
+              <w:bottom w:color="1f1f1f" w:space="0" w:sz="5" w:val="single"/>
+              <w:right w:color="1f1f1f" w:space="0" w:sz="5" w:val="single"/>
+            </w:tcBorders>
+            <w:tcMar>
+              <w:top w:w="240.0" w:type="dxa"/>
+              <w:left w:w="120.0" w:type="dxa"/>
+              <w:bottom w:w="240.0" w:type="dxa"/>
+              <w:right w:w="180.0" w:type="dxa"/>
+            </w:tcMar>
+            <w:vAlign w:val="top"/>
+          </w:tcPr>
+          <w:p>
+            <w:pPr>
+              <w:spacing w:line="240" w:lineRule="auto"/>
+              <w:rPr/>
+            </w:pPr>
+            <w:r>
+              <w:rPr>
+                <w:rtl w:val="0"/>
+              </w:rPr>
+              <w:t xml:space="preserve">Post Condition:</w:t>
+            </w:r>
+          </w:p>
+        </w:tc>
+        <w:tc>
+          <w:tcPr>
+            <w:tcBorders>
+              <w:top w:color="1f1f1f" w:space="0" w:sz="5" w:val="single"/>
+              <w:left w:color="1f1f1f" w:space="0" w:sz="5" w:val="single"/>
+              <w:bottom w:color="1f1f1f" w:space="0" w:sz="5" w:val="single"/>
+              <w:right w:color="1f1f1f" w:space="0" w:sz="5" w:val="single"/>
+            </w:tcBorders>
+            <w:tcMar>
+              <w:top w:w="240.0" w:type="dxa"/>
+              <w:left w:w="0.0" w:type="dxa"/>
+              <w:bottom w:w="240.0" w:type="dxa"/>
+              <w:right w:w="0.0" w:type="dxa"/>
+            </w:tcMar>
+            <w:vAlign w:val="top"/>
+          </w:tcPr>
+          <w:p>
+            <w:pPr>
+              <w:spacing w:line="240" w:lineRule="auto"/>
+              <w:rPr/>
+            </w:pPr>
+            <w:r>
+              <w:rPr>
+                <w:rtl w:val="0"/>
+              </w:rPr>
+              <w:t xml:space="preserve">A new branch is active and its Librarian can log in.</w:t>
+            </w:r>
+          </w:p>
+        </w:tc>
+      </w:tr>
+    </w:tbl>
+    <w:p>
+      <w:pPr>
+        <w:rPr/>
+      </w:pPr>
+      <w:r>
+        <w:rPr>
+          <w:rtl w:val="0"/>
+        </w:rPr>
+      </w:r>
+    </w:p>
+    <w:p>
+      <w:pPr>
+        <w:rPr/>
+      </w:pPr>
+      <w:r>
+        <w:rPr>
+          <w:rtl w:val="0"/>
+        </w:rPr>
+      </w:r>
+    </w:p>
+    <w:tbl>
+      <w:tblPr>
+        <w:tblStyle w:val="Table26"/>
+        <w:tblW w:w="8895.0" w:type="dxa"/>
+        <w:jc w:val="left"/>
+        <w:tblBorders>
+          <w:top w:color="000000" w:space="0" w:sz="0" w:val="nil"/>
+          <w:left w:color="000000" w:space="0" w:sz="0" w:val="nil"/>
+          <w:bottom w:color="000000" w:space="0" w:sz="0" w:val="nil"/>
+          <w:right w:color="000000" w:space="0" w:sz="0" w:val="nil"/>
+          <w:insideH w:color="000000" w:space="0" w:sz="0" w:val="nil"/>
+          <w:insideV w:color="000000" w:space="0" w:sz="0" w:val="nil"/>
+        </w:tblBorders>
+        <w:tblLayout w:type="fixed"/>
+        <w:tblLook w:val="0600"/>
+      </w:tblPr>
+      <w:tblGrid>
+        <w:gridCol w:w="1980"/>
+        <w:gridCol w:w="6915"/>
+        <w:tblGridChange w:id="0">
+          <w:tblGrid>
+            <w:gridCol w:w="1980"/>
+            <w:gridCol w:w="6915"/>
+          </w:tblGrid>
+        </w:tblGridChange>
+      </w:tblGrid>
+      <w:tr>
+        <w:trPr>
+          <w:cantSplit w:val="0"/>
+          <w:trHeight w:val="600" w:hRule="atLeast"/>
+          <w:tblHeader w:val="0"/>
+        </w:trPr>
+        <w:tc>
+          <w:tcPr>
+            <w:tcBorders>
+              <w:top w:color="1f1f1f" w:space="0" w:sz="5" w:val="single"/>
+              <w:left w:color="1f1f1f" w:space="0" w:sz="5" w:val="single"/>
+              <w:bottom w:color="1f1f1f" w:space="0" w:sz="5" w:val="single"/>
+              <w:right w:color="1f1f1f" w:space="0" w:sz="5" w:val="single"/>
+            </w:tcBorders>
+            <w:tcMar>
+              <w:top w:w="240.0" w:type="dxa"/>
+              <w:left w:w="120.0" w:type="dxa"/>
+              <w:bottom w:w="240.0" w:type="dxa"/>
+              <w:right w:w="180.0" w:type="dxa"/>
+            </w:tcMar>
+            <w:vAlign w:val="top"/>
+          </w:tcPr>
+          <w:p>
+            <w:pPr>
+              <w:spacing w:line="240" w:lineRule="auto"/>
+              <w:rPr/>
+            </w:pPr>
+            <w:r>
+              <w:rPr>
+                <w:rtl w:val="0"/>
+              </w:rPr>
+              <w:t xml:space="preserve">Use Case No:</w:t>
+            </w:r>
+          </w:p>
+        </w:tc>
+        <w:tc>
+          <w:tcPr>
+            <w:tcBorders>
+              <w:top w:color="1f1f1f" w:space="0" w:sz="5" w:val="single"/>
+              <w:left w:color="1f1f1f" w:space="0" w:sz="5" w:val="single"/>
+              <w:bottom w:color="1f1f1f" w:space="0" w:sz="5" w:val="single"/>
+              <w:right w:color="1f1f1f" w:space="0" w:sz="5" w:val="single"/>
+            </w:tcBorders>
+            <w:tcMar>
+              <w:top w:w="240.0" w:type="dxa"/>
+              <w:left w:w="0.0" w:type="dxa"/>
+              <w:bottom w:w="240.0" w:type="dxa"/>
+              <w:right w:w="0.0" w:type="dxa"/>
+            </w:tcMar>
+            <w:vAlign w:val="top"/>
+          </w:tcPr>
+          <w:p>
+            <w:pPr>
+              <w:spacing w:line="240" w:lineRule="auto"/>
+              <w:rPr/>
+            </w:pPr>
+            <w:r>
+              <w:rPr>
+                <w:rtl w:val="0"/>
+              </w:rPr>
+              <w:t xml:space="preserve">UC-25</w:t>
+            </w:r>
+          </w:p>
+        </w:tc>
+      </w:tr>
+      <w:tr>
+        <w:trPr>
+          <w:cantSplit w:val="0"/>
+          <w:trHeight w:val="450" w:hRule="atLeast"/>
+          <w:tblHeader w:val="0"/>
+        </w:trPr>
+        <w:tc>
+          <w:tcPr>
+            <w:tcBorders>
+              <w:top w:color="1f1f1f" w:space="0" w:sz="5" w:val="single"/>
+              <w:left w:color="1f1f1f" w:space="0" w:sz="5" w:val="single"/>
+              <w:bottom w:color="1f1f1f" w:space="0" w:sz="5" w:val="single"/>
+              <w:right w:color="1f1f1f" w:space="0" w:sz="5" w:val="single"/>
+            </w:tcBorders>
+            <w:tcMar>
+              <w:top w:w="240.0" w:type="dxa"/>
+              <w:left w:w="120.0" w:type="dxa"/>
+              <w:bottom w:w="240.0" w:type="dxa"/>
+              <w:right w:w="180.0" w:type="dxa"/>
+            </w:tcMar>
+            <w:vAlign w:val="top"/>
+          </w:tcPr>
+          <w:p>
+            <w:pPr>
+              <w:spacing w:line="240" w:lineRule="auto"/>
+              <w:rPr/>
+            </w:pPr>
+            <w:r>
+              <w:rPr>
+                <w:rtl w:val="0"/>
+              </w:rPr>
+              <w:t xml:space="preserve">Use Case Name:</w:t>
+            </w:r>
+          </w:p>
+        </w:tc>
+        <w:tc>
+          <w:tcPr>
+            <w:tcBorders>
+              <w:top w:color="1f1f1f" w:space="0" w:sz="5" w:val="single"/>
+              <w:left w:color="1f1f1f" w:space="0" w:sz="5" w:val="single"/>
+              <w:bottom w:color="1f1f1f" w:space="0" w:sz="5" w:val="single"/>
+              <w:right w:color="1f1f1f" w:space="0" w:sz="5" w:val="single"/>
+            </w:tcBorders>
+            <w:tcMar>
+              <w:top w:w="240.0" w:type="dxa"/>
+              <w:left w:w="0.0" w:type="dxa"/>
+              <w:bottom w:w="240.0" w:type="dxa"/>
+              <w:right w:w="0.0" w:type="dxa"/>
+            </w:tcMar>
+            <w:vAlign w:val="top"/>
+          </w:tcPr>
+          <w:p>
+            <w:pPr>
+              <w:spacing w:line="240" w:lineRule="auto"/>
+              <w:rPr/>
+            </w:pPr>
+            <w:r>
+              <w:rPr>
+                <w:rtl w:val="0"/>
+              </w:rPr>
+              <w:t xml:space="preserve">Author and Publisher Page</w:t>
+            </w:r>
+          </w:p>
+        </w:tc>
+      </w:tr>
+      <w:tr>
+        <w:trPr>
+          <w:cantSplit w:val="0"/>
+          <w:trHeight w:val="720" w:hRule="atLeast"/>
+          <w:tblHeader w:val="0"/>
+        </w:trPr>
+        <w:tc>
+          <w:tcPr>
+            <w:tcBorders>
+              <w:top w:color="1f1f1f" w:space="0" w:sz="5" w:val="single"/>
+              <w:left w:color="1f1f1f" w:space="0" w:sz="5" w:val="single"/>
+              <w:bottom w:color="1f1f1f" w:space="0" w:sz="5" w:val="single"/>
+              <w:right w:color="1f1f1f" w:space="0" w:sz="5" w:val="single"/>
+            </w:tcBorders>
+            <w:tcMar>
+              <w:top w:w="240.0" w:type="dxa"/>
+              <w:left w:w="120.0" w:type="dxa"/>
+              <w:bottom w:w="240.0" w:type="dxa"/>
+              <w:right w:w="180.0" w:type="dxa"/>
+            </w:tcMar>
+            <w:vAlign w:val="top"/>
+          </w:tcPr>
+          <w:p>
+            <w:pPr>
+              <w:spacing w:line="240" w:lineRule="auto"/>
+              <w:rPr/>
+            </w:pPr>
+            <w:r>
+              <w:rPr>
+                <w:rtl w:val="0"/>
+              </w:rPr>
+              <w:t xml:space="preserve">Overview:</w:t>
+            </w:r>
+          </w:p>
+        </w:tc>
+        <w:tc>
+          <w:tcPr>
+            <w:tcBorders>
+              <w:top w:color="1f1f1f" w:space="0" w:sz="5" w:val="single"/>
+              <w:left w:color="1f1f1f" w:space="0" w:sz="5" w:val="single"/>
+              <w:bottom w:color="1f1f1f" w:space="0" w:sz="5" w:val="single"/>
+              <w:right w:color="1f1f1f" w:space="0" w:sz="5" w:val="single"/>
+            </w:tcBorders>
+            <w:tcMar>
+              <w:top w:w="240.0" w:type="dxa"/>
+              <w:left w:w="0.0" w:type="dxa"/>
+              <w:bottom w:w="240.0" w:type="dxa"/>
+              <w:right w:w="0.0" w:type="dxa"/>
+            </w:tcMar>
+            <w:vAlign w:val="top"/>
+          </w:tcPr>
+          <w:p>
+            <w:pPr>
+              <w:spacing w:line="240" w:lineRule="auto"/>
+              <w:rPr/>
+            </w:pPr>
+            <w:r>
+              <w:rPr>
+                <w:rtl w:val="0"/>
+              </w:rPr>
+              <w:t xml:space="preserve">User should be able to see the Author and Publisher pages.</w:t>
+            </w:r>
+          </w:p>
+        </w:tc>
+      </w:tr>
+      <w:tr>
+        <w:trPr>
+          <w:cantSplit w:val="0"/>
+          <w:trHeight w:val="120" w:hRule="atLeast"/>
+          <w:tblHeader w:val="0"/>
+        </w:trPr>
+        <w:tc>
+          <w:tcPr>
+            <w:tcBorders>
+              <w:top w:color="1f1f1f" w:space="0" w:sz="5" w:val="single"/>
+              <w:left w:color="1f1f1f" w:space="0" w:sz="5" w:val="single"/>
+              <w:bottom w:color="1f1f1f" w:space="0" w:sz="5" w:val="single"/>
+              <w:right w:color="1f1f1f" w:space="0" w:sz="5" w:val="single"/>
+            </w:tcBorders>
+            <w:tcMar>
+              <w:top w:w="240.0" w:type="dxa"/>
+              <w:left w:w="120.0" w:type="dxa"/>
+              <w:bottom w:w="240.0" w:type="dxa"/>
+              <w:right w:w="180.0" w:type="dxa"/>
+            </w:tcMar>
+            <w:vAlign w:val="top"/>
+          </w:tcPr>
+          <w:p>
+            <w:pPr>
+              <w:spacing w:line="240" w:lineRule="auto"/>
+              <w:rPr/>
+            </w:pPr>
+            <w:r>
+              <w:rPr>
+                <w:rtl w:val="0"/>
+              </w:rPr>
+              <w:t xml:space="preserve">Actors:</w:t>
+            </w:r>
+          </w:p>
+        </w:tc>
+        <w:tc>
+          <w:tcPr>
+            <w:tcBorders>
+              <w:top w:color="1f1f1f" w:space="0" w:sz="5" w:val="single"/>
+              <w:left w:color="1f1f1f" w:space="0" w:sz="5" w:val="single"/>
+              <w:bottom w:color="1f1f1f" w:space="0" w:sz="5" w:val="single"/>
+              <w:right w:color="1f1f1f" w:space="0" w:sz="5" w:val="single"/>
+            </w:tcBorders>
+            <w:tcMar>
+              <w:top w:w="240.0" w:type="dxa"/>
+              <w:left w:w="0.0" w:type="dxa"/>
+              <w:bottom w:w="240.0" w:type="dxa"/>
+              <w:right w:w="0.0" w:type="dxa"/>
+            </w:tcMar>
+            <w:vAlign w:val="top"/>
+          </w:tcPr>
+          <w:p>
+            <w:pPr>
+              <w:spacing w:line="240" w:lineRule="auto"/>
+              <w:rPr/>
+            </w:pPr>
+            <w:r>
+              <w:rPr>
+                <w:rtl w:val="0"/>
+              </w:rPr>
+              <w:t xml:space="preserve">User</w:t>
+            </w:r>
+          </w:p>
+        </w:tc>
+      </w:tr>
+      <w:tr>
+        <w:trPr>
+          <w:cantSplit w:val="0"/>
+          <w:trHeight w:val="135" w:hRule="atLeast"/>
+          <w:tblHeader w:val="0"/>
+        </w:trPr>
+        <w:tc>
+          <w:tcPr>
+            <w:tcBorders>
+              <w:top w:color="1f1f1f" w:space="0" w:sz="5" w:val="single"/>
+              <w:left w:color="1f1f1f" w:space="0" w:sz="5" w:val="single"/>
+              <w:bottom w:color="1f1f1f" w:space="0" w:sz="5" w:val="single"/>
+              <w:right w:color="1f1f1f" w:space="0" w:sz="5" w:val="single"/>
+            </w:tcBorders>
+            <w:tcMar>
+              <w:top w:w="240.0" w:type="dxa"/>
+              <w:left w:w="120.0" w:type="dxa"/>
+              <w:bottom w:w="240.0" w:type="dxa"/>
+              <w:right w:w="180.0" w:type="dxa"/>
+            </w:tcMar>
+            <w:vAlign w:val="top"/>
+          </w:tcPr>
+          <w:p>
+            <w:pPr>
+              <w:spacing w:line="240" w:lineRule="auto"/>
+              <w:rPr/>
+            </w:pPr>
+            <w:r>
+              <w:rPr>
+                <w:rtl w:val="0"/>
+              </w:rPr>
+              <w:t xml:space="preserve">Pre condition:</w:t>
+            </w:r>
+          </w:p>
+        </w:tc>
+        <w:tc>
+          <w:tcPr>
+            <w:tcBorders>
+              <w:top w:color="1f1f1f" w:space="0" w:sz="5" w:val="single"/>
+              <w:left w:color="1f1f1f" w:space="0" w:sz="5" w:val="single"/>
+              <w:bottom w:color="1f1f1f" w:space="0" w:sz="5" w:val="single"/>
+              <w:right w:color="1f1f1f" w:space="0" w:sz="5" w:val="single"/>
+            </w:tcBorders>
+            <w:tcMar>
+              <w:top w:w="240.0" w:type="dxa"/>
+              <w:left w:w="0.0" w:type="dxa"/>
+              <w:bottom w:w="240.0" w:type="dxa"/>
+              <w:right w:w="0.0" w:type="dxa"/>
+            </w:tcMar>
+            <w:vAlign w:val="top"/>
+          </w:tcPr>
+          <w:p>
+            <w:pPr>
+              <w:spacing w:line="240" w:lineRule="auto"/>
+              <w:rPr/>
+            </w:pPr>
+            <w:r>
+              <w:rPr>
+                <w:rtl w:val="0"/>
+              </w:rPr>
+              <w:t xml:space="preserve">User has an account and he searches for Author/Publisher Name.</w:t>
+            </w:r>
+          </w:p>
+        </w:tc>
+      </w:tr>
+      <w:tr>
+        <w:trPr>
+          <w:cantSplit w:val="0"/>
+          <w:trHeight w:val="2955" w:hRule="atLeast"/>
+          <w:tblHeader w:val="0"/>
+        </w:trPr>
+        <w:tc>
+          <w:tcPr>
+            <w:tcBorders>
+              <w:top w:color="1f1f1f" w:space="0" w:sz="5" w:val="single"/>
+              <w:left w:color="1f1f1f" w:space="0" w:sz="5" w:val="single"/>
+              <w:bottom w:color="1f1f1f" w:space="0" w:sz="5" w:val="single"/>
+              <w:right w:color="1f1f1f" w:space="0" w:sz="5" w:val="single"/>
+            </w:tcBorders>
+            <w:tcMar>
+              <w:top w:w="240.0" w:type="dxa"/>
+              <w:left w:w="120.0" w:type="dxa"/>
+              <w:bottom w:w="240.0" w:type="dxa"/>
+              <w:right w:w="180.0" w:type="dxa"/>
+            </w:tcMar>
+            <w:vAlign w:val="top"/>
+          </w:tcPr>
+          <w:p>
+            <w:pPr>
+              <w:spacing w:line="240" w:lineRule="auto"/>
+              <w:rPr/>
+            </w:pPr>
+            <w:r>
+              <w:rPr>
+                <w:rtl w:val="0"/>
+              </w:rPr>
+              <w:t xml:space="preserve">Flow:</w:t>
+            </w:r>
+          </w:p>
+        </w:tc>
+        <w:tc>
+          <w:tcPr>
+            <w:tcBorders>
+              <w:top w:color="1f1f1f" w:space="0" w:sz="5" w:val="single"/>
+              <w:left w:color="1f1f1f" w:space="0" w:sz="5" w:val="single"/>
+              <w:bottom w:color="1f1f1f" w:space="0" w:sz="5" w:val="single"/>
+              <w:right w:color="1f1f1f" w:space="0" w:sz="5" w:val="single"/>
+            </w:tcBorders>
+            <w:tcMar>
+              <w:top w:w="240.0" w:type="dxa"/>
+              <w:left w:w="0.0" w:type="dxa"/>
+              <w:bottom w:w="240.0" w:type="dxa"/>
+              <w:right w:w="0.0" w:type="dxa"/>
+            </w:tcMar>
+            <w:vAlign w:val="top"/>
+          </w:tcPr>
+          <w:p>
+            <w:pPr>
+              <w:spacing w:line="240" w:lineRule="auto"/>
+              <w:rPr/>
+            </w:pPr>
+            <w:r>
+              <w:rPr>
+                <w:rtl w:val="0"/>
+              </w:rPr>
+              <w:t xml:space="preserve">Main Flow:</w:t>
+            </w:r>
+          </w:p>
+          <w:p>
+            <w:pPr>
+              <w:spacing w:line="240" w:lineRule="auto"/>
+              <w:rPr/>
+            </w:pPr>
+            <w:r>
+              <w:rPr>
+                <w:rtl w:val="0"/>
+              </w:rPr>
+            </w:r>
+          </w:p>
+          <w:p>
+            <w:pPr>
+              <w:spacing w:line="240" w:lineRule="auto"/>
+              <w:rPr/>
+            </w:pPr>
+            <w:r>
+              <w:rPr>
+                <w:rtl w:val="0"/>
+              </w:rPr>
+              <w:t xml:space="preserve">1. User finds the searched the Author and Publisher Name and clicks on their name to view more details .</w:t>
+            </w:r>
+          </w:p>
+          <w:p>
+            <w:pPr>
+              <w:spacing w:line="240" w:lineRule="auto"/>
+              <w:rPr/>
+            </w:pPr>
+            <w:r>
+              <w:rPr>
+                <w:rtl w:val="0"/>
+              </w:rPr>
+              <w:t xml:space="preserve">2. User should see the details like Born and Death times, Some summary and other notable books.</w:t>
+            </w:r>
+          </w:p>
+          <w:p>
+            <w:pPr>
+              <w:spacing w:line="240" w:lineRule="auto"/>
+              <w:rPr/>
+            </w:pPr>
+            <w:r>
+              <w:rPr>
+                <w:rtl w:val="0"/>
+              </w:rPr>
+            </w:r>
+          </w:p>
+          <w:p>
+            <w:pPr>
+              <w:spacing w:line="240" w:lineRule="auto"/>
+              <w:rPr/>
+            </w:pPr>
+            <w:r>
+              <w:rPr>
+                <w:rtl w:val="0"/>
+              </w:rPr>
+              <w:t xml:space="preserve">Alternate Flows:</w:t>
+            </w:r>
+          </w:p>
+          <w:p>
+            <w:pPr>
+              <w:spacing w:line="240" w:lineRule="auto"/>
+              <w:rPr/>
+            </w:pPr>
+            <w:r>
+              <w:rPr>
+                <w:rtl w:val="0"/>
+              </w:rPr>
+              <w:t xml:space="preserve">1a. User doesn’t find the searched Author/Publisher</w:t>
+            </w:r>
+          </w:p>
+        </w:tc>
+      </w:tr>
+      <w:tr>
+        <w:trPr>
+          <w:cantSplit w:val="0"/>
+          <w:trHeight w:val="810" w:hRule="atLeast"/>
+          <w:tblHeader w:val="0"/>
+        </w:trPr>
+        <w:tc>
+          <w:tcPr>
+            <w:tcBorders>
+              <w:top w:color="1f1f1f" w:space="0" w:sz="5" w:val="single"/>
+              <w:left w:color="1f1f1f" w:space="0" w:sz="5" w:val="single"/>
+              <w:bottom w:color="1f1f1f" w:space="0" w:sz="5" w:val="single"/>
+              <w:right w:color="1f1f1f" w:space="0" w:sz="5" w:val="single"/>
+            </w:tcBorders>
+            <w:tcMar>
+              <w:top w:w="240.0" w:type="dxa"/>
+              <w:left w:w="120.0" w:type="dxa"/>
+              <w:bottom w:w="240.0" w:type="dxa"/>
+              <w:right w:w="180.0" w:type="dxa"/>
+            </w:tcMar>
+            <w:vAlign w:val="top"/>
+          </w:tcPr>
+          <w:p>
+            <w:pPr>
+              <w:spacing w:line="240" w:lineRule="auto"/>
+              <w:rPr/>
+            </w:pPr>
+            <w:r>
+              <w:rPr>
+                <w:rtl w:val="0"/>
+              </w:rPr>
+              <w:t xml:space="preserve">Post Condition:</w:t>
+            </w:r>
+          </w:p>
+        </w:tc>
+        <w:tc>
+          <w:tcPr>
+            <w:tcBorders>
+              <w:top w:color="1f1f1f" w:space="0" w:sz="5" w:val="single"/>
+              <w:left w:color="1f1f1f" w:space="0" w:sz="5" w:val="single"/>
+              <w:bottom w:color="1f1f1f" w:space="0" w:sz="5" w:val="single"/>
+              <w:right w:color="1f1f1f" w:space="0" w:sz="5" w:val="single"/>
+            </w:tcBorders>
+            <w:tcMar>
+              <w:top w:w="240.0" w:type="dxa"/>
+              <w:left w:w="0.0" w:type="dxa"/>
+              <w:bottom w:w="240.0" w:type="dxa"/>
+              <w:right w:w="0.0" w:type="dxa"/>
+            </w:tcMar>
+            <w:vAlign w:val="top"/>
+          </w:tcPr>
+          <w:p>
+            <w:pPr>
+              <w:spacing w:line="240" w:lineRule="auto"/>
+              <w:rPr/>
+            </w:pPr>
+            <w:r>
+              <w:rPr>
+                <w:rtl w:val="0"/>
+              </w:rPr>
+              <w:t xml:space="preserve">User sees the info about their favourite Author/Publisher page and can browse through the details</w:t>
+            </w:r>
+          </w:p>
+        </w:tc>
+      </w:tr>
+    </w:tbl>
+    <w:p>
+      <w:pPr>
+        <w:rPr/>
+      </w:pPr>
+      <w:r>
+        <w:rPr>
+          <w:rtl w:val="0"/>
+        </w:rPr>
+      </w:r>
+    </w:p>
     <w:p>
       <w:pPr>
         <w:rPr/>
@@ -21328,6 +23048,22 @@
       <w:tblCellMar/>
     </w:tblPr>
   </w:style>
+  <w:style w:type="table" w:styleId="Table25">
+    <w:basedOn w:val="TableNormal"/>
+    <w:tblPr>
+      <w:tblStyleRowBandSize w:val="1"/>
+      <w:tblStyleColBandSize w:val="1"/>
+      <w:tblCellMar/>
+    </w:tblPr>
+  </w:style>
+  <w:style w:type="table" w:styleId="Table26">
+    <w:basedOn w:val="TableNormal"/>
+    <w:tblPr>
+      <w:tblStyleRowBandSize w:val="1"/>
+      <w:tblStyleColBandSize w:val="1"/>
+      <w:tblCellMar/>
+    </w:tblPr>
+  </w:style>
 </w:styles>
 </file>
 

</xml_diff>